<commit_message>
Articolul 7 si 8
</commit_message>
<xml_diff>
--- a/text/3.literatura_de_specialitate/Literatura_de_specialitate.docx
+++ b/text/3.literatura_de_specialitate/Literatura_de_specialitate.docx
@@ -719,19 +719,7 @@
         <w:t>lucrării de cercetare “Work in the European Gig Economy” realizate de Ursula HUWS, Neil H. SPENCER, Dag S. SYRDAL, Kaire HOLTS</w:t>
       </w:r>
       <w:r>
-        <w:t xml:space="preserve"> de la </w:t>
-      </w:r>
-      <w:r>
-        <w:rPr>
-          <w:lang w:val="en-US"/>
-        </w:rPr>
-        <w:t>“</w:t>
-      </w:r>
-      <w:r>
-        <w:t>Hertfordshire School of Business</w:t>
-      </w:r>
-      <w:r>
-        <w:t>”</w:t>
+        <w:t xml:space="preserve"> de la “Hertfordshire School of Business”</w:t>
       </w:r>
       <w:r>
         <w:t>, solidifică, prin aceste procente, schimbarea modului în care o persoana își obține venitul lunar și tendințe</w:t>
@@ -827,13 +815,22 @@
     </w:p>
     <w:p>
       <w:r>
-        <w:t xml:space="preserve">Perioada pandemică a reprezentat o schimbare radicală care a forțat toate persoanele să își schimbe stilul de viață, inclusiv câștigarea traiului. Astfel mai multe persoane au fost nevoite să se adapteze la noile condiții, chiar dacă circumstanțele au fost nefavorabile. Printr-un sondaj, ce conține răspunsuri din Cehia, Slovacia, Franța, Letonia și Slovenia, realizat de autorii </w:t>
-      </w:r>
-      <w:r>
-        <w:t>Szilárd Szigeti , Vivien Pásztóová, Csilla Mezősi</w:t>
-      </w:r>
-      <w:r>
-        <w:t xml:space="preserve">, au fost puse în evidență efectele negative asupra stilului de viață și asupra locului de muncă. Participanții </w:t>
+        <w:tab/>
+      </w:r>
+      <w:r>
+        <w:t xml:space="preserve">Perioada pandemică a reprezentat </w:t>
+      </w:r>
+      <w:r>
+        <w:t xml:space="preserve">u șoc neprevăzut economic și social, </w:t>
+      </w:r>
+      <w:r>
+        <w:t>care a forțat persoanele să își schimbe stilul de viață, inclusiv câștigarea traiului. Astfel mai mul</w:t>
+      </w:r>
+      <w:r>
+        <w:t xml:space="preserve">ți indiviză au fost nevoiți </w:t>
+      </w:r>
+      <w:r>
+        <w:t xml:space="preserve">să se adapteze la noile condiții, chiar dacă circumstanțele au fost nefavorabile. Printr-un sondaj, ce conține răspunsuri din Cehia, Slovacia, Franța, Letonia și Slovenia, realizat de autorii Szilárd Szigeti , Vivien Pásztóová, Csilla Mezősi, au fost puse în evidență efectele negative asupra stilului de viață și asupra locului de muncă. Participanții </w:t>
       </w:r>
       <w:r>
         <w:t>eșantionului</w:t>
@@ -860,22 +857,10 @@
         <w:t xml:space="preserve">Se </w:t>
       </w:r>
       <w:r>
-        <w:t>menționează în lucrare faptul că există trei tipuri de afecțiuni cu Covid-19 în funcție de durata boli și anume</w:t>
-      </w:r>
-      <w:r>
-        <w:rPr>
-          <w:lang w:val="en-US"/>
-        </w:rPr>
-        <w:t xml:space="preserve">: </w:t>
-      </w:r>
-      <w:r>
-        <w:rPr>
-          <w:lang w:val="en-US"/>
-        </w:rPr>
-        <w:t>Covid-19 acut, care dureaz</w:t>
-      </w:r>
-      <w:r>
-        <w:t>ă 4 săptămâni, post acut, între 4 și 12 săptămâni și Long-Covid, care depășește 12 săptămâni.</w:t>
+        <w:t xml:space="preserve">menționează în lucrare faptul că există trei tipuri de afecțiuni cu Covid-19 în funcție de durata boli și anume: </w:t>
+      </w:r>
+      <w:r>
+        <w:t>Covid-19 acut, care durează 4 săptămâni, post acut, între 4 și 12 săptămâni și Long-Covid, care depășește 12 săptămâni.</w:t>
       </w:r>
       <w:r>
         <w:t xml:space="preserve"> Eșantionul a vizat în special pacienții cu sindromul post-acut sau Long-Covid.</w:t>
@@ -884,35 +869,250 @@
     <w:p>
       <w:pPr>
         <w:rPr>
-          <w:b/>
-          <w:bCs/>
-          <w:u w:val="single"/>
-        </w:rPr>
-      </w:pPr>
-      <w:r>
-        <w:rPr>
-          <w:b/>
-          <w:bCs/>
-          <w:u w:val="single"/>
-        </w:rPr>
-        <w:t>Articol 7</w:t>
+          <w:u w:val="single"/>
+        </w:rPr>
+      </w:pPr>
+      <w:r>
+        <w:rPr>
+          <w:u w:val="single"/>
+        </w:rPr>
+        <w:t>Efectul pandemiei de COVID-19 asupra forței de muncă din țările componente Visegrad</w:t>
       </w:r>
     </w:p>
     <w:p>
-      <w:pPr>
-        <w:rPr>
-          <w:b/>
-          <w:bCs/>
-          <w:u w:val="single"/>
-        </w:rPr>
-      </w:pPr>
-      <w:r>
-        <w:rPr>
-          <w:b/>
-          <w:bCs/>
-          <w:u w:val="single"/>
-        </w:rPr>
-        <w:t>Articol 8</w:t>
+      <w:r>
+        <w:tab/>
+      </w:r>
+      <w:r>
+        <w:t xml:space="preserve">Pandemia de COVID-19 a avut efecte vizibile asupra agenților economici, dar și asupra economiei țărilor. În această ipoteză, lucrarea de cercetare a autorului Mariusz Zieliński </w:t>
+      </w:r>
+      <w:r>
+        <w:t>de la Facultatea de Economie și Management</w:t>
+      </w:r>
+      <w:r>
+        <w:t>,</w:t>
+      </w:r>
+      <w:r>
+        <w:t xml:space="preserve"> Universit</w:t>
+      </w:r>
+      <w:r>
+        <w:t>atea</w:t>
+      </w:r>
+      <w:r>
+        <w:t xml:space="preserve"> </w:t>
+      </w:r>
+      <w:r>
+        <w:t xml:space="preserve">Tehnică </w:t>
+      </w:r>
+      <w:r>
+        <w:t>Opole</w:t>
+      </w:r>
+      <w:r>
+        <w:t xml:space="preserve">, a urmărit studierea profunzimii efectelor negative cauzate de pandemie asupra </w:t>
+      </w:r>
+      <w:r>
+        <w:t>forței de muncă a</w:t>
+      </w:r>
+      <w:r>
+        <w:t xml:space="preserve"> țărilor componente Visegrad. Perioada analizată este 2018-2021, autorul observând faptul că șomajul nu a crescut cu mai de 1,3% în Cehia, Ungaria și Polonia și cu 1,8% în Slovacia.</w:t>
+      </w:r>
+      <w:r>
+        <w:t xml:space="preserve"> De asemenea ocuparea forței de muncă a depășit nivelul prepandemic în acest grup, expcepție făcând Cehia și Slovacia. Indivizii au apelat la independenț</w:t>
+      </w:r>
+      <w:r>
+        <w:t>a</w:t>
+      </w:r>
+      <w:r>
+        <w:t xml:space="preserve"> față de un loc de muncă fix, indicând nevoia și disponibilitatea oamenilor de lucra pe cont propriu prin diferite metode pentru își asigura traiul.</w:t>
+      </w:r>
+      <w:r>
+        <w:t xml:space="preserve"> Din punct de vedere demografic, autorul nu a identificat o rată a șomajului diferențiată în funcție de sex, </w:t>
+      </w:r>
+      <w:r>
+        <w:t>fiind</w:t>
+      </w:r>
+      <w:r>
+        <w:t xml:space="preserve"> proporții egale de creștere</w:t>
+      </w:r>
+      <w:r>
+        <w:t xml:space="preserve">. În rândul persoanelor cu educație scăzută, autorul a identificat </w:t>
+      </w:r>
+      <w:r>
+        <w:t xml:space="preserve">pentru Slovacia </w:t>
+      </w:r>
+      <w:r>
+        <w:t xml:space="preserve">o creștere semnificativă, de la 30,6% la 43,5%, a </w:t>
+      </w:r>
+      <w:r>
+        <w:t xml:space="preserve">ratei </w:t>
+      </w:r>
+      <w:r>
+        <w:t>șomajului.</w:t>
+      </w:r>
+      <w:r>
+        <w:t xml:space="preserve"> Categoria persoanelor cuprinse între 55 și 64 de ani, cu referire la Ungaria a înregistrat o creștere </w:t>
+      </w:r>
+      <w:r>
+        <w:t xml:space="preserve">a </w:t>
+      </w:r>
+      <w:r>
+        <w:t>șomajului</w:t>
+      </w:r>
+      <w:r>
+        <w:t xml:space="preserve"> mai mare decât media generală.</w:t>
+      </w:r>
+      <w:r>
+        <w:t xml:space="preserve"> Autorul </w:t>
+      </w:r>
+      <w:r>
+        <w:t>încheie prin a remarca eficacitatea cu care aceste țări au reușit să țină sub control rata șomajului și a ocupării forței de muncă</w:t>
+      </w:r>
+      <w:r>
+        <w:t xml:space="preserve">, neexistând riscul de persistență a </w:t>
+      </w:r>
+      <w:r>
+        <w:t>șomajului</w:t>
+      </w:r>
+      <w:r>
+        <w:t xml:space="preserve"> pe termen lung.</w:t>
+      </w:r>
+    </w:p>
+    <w:p/>
+    <w:p>
+      <w:pPr>
+        <w:rPr>
+          <w:u w:val="single"/>
+        </w:rPr>
+      </w:pPr>
+      <w:r>
+        <w:rPr>
+          <w:u w:val="single"/>
+        </w:rPr>
+        <w:lastRenderedPageBreak/>
+        <w:t>Impactul Inteligenței artificiale pe piața muncii din Europa</w:t>
+      </w:r>
+    </w:p>
+    <w:p>
+      <w:r>
+        <w:tab/>
+        <w:t>Sistemele inteligente dezvoltate de cercetători și experții din domeniu aduc beneficii vizibile la nivelul productivității</w:t>
+      </w:r>
+      <w:r>
+        <w:t xml:space="preserve"> și al creșterii economice, dar odată cu apariția acestor sisteme crește riscul alterare a structurii forței de muncă. Auto</w:t>
+      </w:r>
+      <w:r>
+        <w:t>rul lucrării,</w:t>
+      </w:r>
+      <w:r>
+        <w:t xml:space="preserve"> Grabriela Calinescu</w:t>
+      </w:r>
+      <w:r>
+        <w:t xml:space="preserve">, </w:t>
+      </w:r>
+      <w:r>
+        <w:t>a obținut o concluzie importantă</w:t>
+      </w:r>
+      <w:r>
+        <w:t xml:space="preserve"> prin analiza datelor oferite de Eurostat,</w:t>
+      </w:r>
+      <w:r>
+        <w:t xml:space="preserve"> cu privire la efectele pe care le va aduce inteligența artificială la nivelul pieței muncii. </w:t>
+      </w:r>
+      <w:r>
+        <w:t xml:space="preserve">Pentru a pune într-o lumină mai clară situația actuală, </w:t>
+      </w:r>
+      <w:r>
+        <w:t xml:space="preserve"> articolul </w:t>
+      </w:r>
+      <w:r>
+        <w:t xml:space="preserve">clasifică locurile de muncă existente în </w:t>
+      </w:r>
+      <w:r>
+        <w:t xml:space="preserve">funcție de riscul de automatizare. </w:t>
+      </w:r>
+      <w:r>
+        <w:t xml:space="preserve">Astfel, cele cu risc scăzut </w:t>
+      </w:r>
+      <w:r>
+        <w:t>necesită</w:t>
+      </w:r>
+      <w:r>
+        <w:t xml:space="preserve"> competențe</w:t>
+      </w:r>
+      <w:r>
+        <w:t xml:space="preserve"> </w:t>
+      </w:r>
+      <w:r>
+        <w:t>de natură umană</w:t>
+      </w:r>
+      <w:r>
+        <w:rPr>
+          <w:lang w:val="en-US"/>
+        </w:rPr>
+        <w:t>,</w:t>
+      </w:r>
+      <w:r>
+        <w:rPr>
+          <w:lang w:val="en-US"/>
+        </w:rPr>
+        <w:t xml:space="preserve"> </w:t>
+      </w:r>
+      <w:r>
+        <w:t xml:space="preserve"> </w:t>
+      </w:r>
+      <w:r>
+        <w:t>colaborarea în echipă, comunicarea și gândirea critică.</w:t>
+      </w:r>
+      <w:r>
+        <w:t xml:space="preserve"> Printre aceste locuri de muncă se numără</w:t>
+      </w:r>
+      <w:r>
+        <w:t xml:space="preserve"> pozițiile de gestionare a resurselor și pozițiile de conducer</w:t>
+      </w:r>
+      <w:r>
+        <w:t xml:space="preserve">e. </w:t>
+      </w:r>
+      <w:r>
+        <w:t xml:space="preserve">Persoanele care lucrează în fabrică sau </w:t>
+      </w:r>
+      <w:r>
+        <w:t>cele</w:t>
+      </w:r>
+      <w:r>
+        <w:t xml:space="preserve"> care</w:t>
+      </w:r>
+      <w:r>
+        <w:t xml:space="preserve"> prezintă dizabilități </w:t>
+      </w:r>
+      <w:r>
+        <w:t xml:space="preserve"> </w:t>
+      </w:r>
+      <w:r>
+        <w:t>sunt mult mai expuse la acest risc al integrării inteligenței artificiale în procesul de muncă</w:t>
+      </w:r>
+      <w:r>
+        <w:t>, conform articolului.</w:t>
+      </w:r>
+      <w:r>
+        <w:t xml:space="preserve"> </w:t>
+      </w:r>
+      <w:r>
+        <w:t>De asemenea, autorul prezintă câteva dintre sectoarele economice unde integrarea sistemului de inteligență artificială aduce schimbări. În domeniul de fabricație, sisteme de automatizare a controlului calității și de gestionare a stocului îmbunătățesc productivitatea și scad costurile.</w:t>
+      </w:r>
+      <w:r>
+        <w:t xml:space="preserve"> Articolul aduce la cunoștință </w:t>
+      </w:r>
+      <w:r>
+        <w:t>cu sistemele inteligente sunt folosite și în domeniul bancar pentru a evalua riscurile și pentru a facilita procesul de decizie</w:t>
+      </w:r>
+      <w:r>
+        <w:t xml:space="preserve"> pentru investiții.</w:t>
+      </w:r>
+      <w:r>
+        <w:t xml:space="preserve"> Pentru o privire de ansamblu, datele statistice prezentate în lucrare arată că, în 2021 8% din totalul afacerilor din Uniunea Europeană au integrat inteligența artificială, iar 28% din companiile mari au adoptat această tehnologie.</w:t>
+      </w:r>
+      <w:r>
+        <w:t xml:space="preserve"> Predominant este sectorul IT, unde 25% dintre companii au optat pentru utilizarea acestor inovații, iar sectorul construcțiilor și al transporturilor au avut cel mai mic procentaj de adopție, în proporție de 5%. </w:t>
       </w:r>
     </w:p>
     <w:p>
@@ -1133,6 +1333,155 @@
     </w:lvl>
   </w:abstractNum>
   <w:abstractNum w:abstractNumId="1" w15:restartNumberingAfterBreak="0">
+    <w:nsid w:val="07417B7B"/>
+    <w:multiLevelType w:val="multilevel"/>
+    <w:tmpl w:val="D8F84C80"/>
+    <w:lvl w:ilvl="0">
+      <w:start w:val="1"/>
+      <w:numFmt w:val="bullet"/>
+      <w:lvlText w:val=""/>
+      <w:lvlJc w:val="left"/>
+      <w:pPr>
+        <w:tabs>
+          <w:tab w:val="num" w:pos="720"/>
+        </w:tabs>
+        <w:ind w:left="720" w:hanging="360"/>
+      </w:pPr>
+      <w:rPr>
+        <w:rFonts w:ascii="Symbol" w:hAnsi="Symbol" w:hint="default"/>
+        <w:sz w:val="20"/>
+      </w:rPr>
+    </w:lvl>
+    <w:lvl w:ilvl="1" w:tentative="1">
+      <w:start w:val="1"/>
+      <w:numFmt w:val="bullet"/>
+      <w:lvlText w:val="o"/>
+      <w:lvlJc w:val="left"/>
+      <w:pPr>
+        <w:tabs>
+          <w:tab w:val="num" w:pos="1440"/>
+        </w:tabs>
+        <w:ind w:left="1440" w:hanging="360"/>
+      </w:pPr>
+      <w:rPr>
+        <w:rFonts w:ascii="Courier New" w:hAnsi="Courier New" w:hint="default"/>
+        <w:sz w:val="20"/>
+      </w:rPr>
+    </w:lvl>
+    <w:lvl w:ilvl="2" w:tentative="1">
+      <w:start w:val="1"/>
+      <w:numFmt w:val="bullet"/>
+      <w:lvlText w:val=""/>
+      <w:lvlJc w:val="left"/>
+      <w:pPr>
+        <w:tabs>
+          <w:tab w:val="num" w:pos="2160"/>
+        </w:tabs>
+        <w:ind w:left="2160" w:hanging="360"/>
+      </w:pPr>
+      <w:rPr>
+        <w:rFonts w:ascii="Wingdings" w:hAnsi="Wingdings" w:hint="default"/>
+        <w:sz w:val="20"/>
+      </w:rPr>
+    </w:lvl>
+    <w:lvl w:ilvl="3" w:tentative="1">
+      <w:start w:val="1"/>
+      <w:numFmt w:val="bullet"/>
+      <w:lvlText w:val=""/>
+      <w:lvlJc w:val="left"/>
+      <w:pPr>
+        <w:tabs>
+          <w:tab w:val="num" w:pos="2880"/>
+        </w:tabs>
+        <w:ind w:left="2880" w:hanging="360"/>
+      </w:pPr>
+      <w:rPr>
+        <w:rFonts w:ascii="Wingdings" w:hAnsi="Wingdings" w:hint="default"/>
+        <w:sz w:val="20"/>
+      </w:rPr>
+    </w:lvl>
+    <w:lvl w:ilvl="4" w:tentative="1">
+      <w:start w:val="1"/>
+      <w:numFmt w:val="bullet"/>
+      <w:lvlText w:val=""/>
+      <w:lvlJc w:val="left"/>
+      <w:pPr>
+        <w:tabs>
+          <w:tab w:val="num" w:pos="3600"/>
+        </w:tabs>
+        <w:ind w:left="3600" w:hanging="360"/>
+      </w:pPr>
+      <w:rPr>
+        <w:rFonts w:ascii="Wingdings" w:hAnsi="Wingdings" w:hint="default"/>
+        <w:sz w:val="20"/>
+      </w:rPr>
+    </w:lvl>
+    <w:lvl w:ilvl="5" w:tentative="1">
+      <w:start w:val="1"/>
+      <w:numFmt w:val="bullet"/>
+      <w:lvlText w:val=""/>
+      <w:lvlJc w:val="left"/>
+      <w:pPr>
+        <w:tabs>
+          <w:tab w:val="num" w:pos="4320"/>
+        </w:tabs>
+        <w:ind w:left="4320" w:hanging="360"/>
+      </w:pPr>
+      <w:rPr>
+        <w:rFonts w:ascii="Wingdings" w:hAnsi="Wingdings" w:hint="default"/>
+        <w:sz w:val="20"/>
+      </w:rPr>
+    </w:lvl>
+    <w:lvl w:ilvl="6" w:tentative="1">
+      <w:start w:val="1"/>
+      <w:numFmt w:val="bullet"/>
+      <w:lvlText w:val=""/>
+      <w:lvlJc w:val="left"/>
+      <w:pPr>
+        <w:tabs>
+          <w:tab w:val="num" w:pos="5040"/>
+        </w:tabs>
+        <w:ind w:left="5040" w:hanging="360"/>
+      </w:pPr>
+      <w:rPr>
+        <w:rFonts w:ascii="Wingdings" w:hAnsi="Wingdings" w:hint="default"/>
+        <w:sz w:val="20"/>
+      </w:rPr>
+    </w:lvl>
+    <w:lvl w:ilvl="7" w:tentative="1">
+      <w:start w:val="1"/>
+      <w:numFmt w:val="bullet"/>
+      <w:lvlText w:val=""/>
+      <w:lvlJc w:val="left"/>
+      <w:pPr>
+        <w:tabs>
+          <w:tab w:val="num" w:pos="5760"/>
+        </w:tabs>
+        <w:ind w:left="5760" w:hanging="360"/>
+      </w:pPr>
+      <w:rPr>
+        <w:rFonts w:ascii="Wingdings" w:hAnsi="Wingdings" w:hint="default"/>
+        <w:sz w:val="20"/>
+      </w:rPr>
+    </w:lvl>
+    <w:lvl w:ilvl="8" w:tentative="1">
+      <w:start w:val="1"/>
+      <w:numFmt w:val="bullet"/>
+      <w:lvlText w:val=""/>
+      <w:lvlJc w:val="left"/>
+      <w:pPr>
+        <w:tabs>
+          <w:tab w:val="num" w:pos="6480"/>
+        </w:tabs>
+        <w:ind w:left="6480" w:hanging="360"/>
+      </w:pPr>
+      <w:rPr>
+        <w:rFonts w:ascii="Wingdings" w:hAnsi="Wingdings" w:hint="default"/>
+        <w:sz w:val="20"/>
+      </w:rPr>
+    </w:lvl>
+  </w:abstractNum>
+  <w:abstractNum w:abstractNumId="2" w15:restartNumberingAfterBreak="0">
     <w:nsid w:val="1BE146A8"/>
     <w:multiLevelType w:val="hybridMultilevel"/>
     <w:tmpl w:val="43CC4218"/>
@@ -1221,7 +1570,603 @@
       </w:pPr>
     </w:lvl>
   </w:abstractNum>
-  <w:abstractNum w:abstractNumId="2" w15:restartNumberingAfterBreak="0">
+  <w:abstractNum w:abstractNumId="3" w15:restartNumberingAfterBreak="0">
+    <w:nsid w:val="2E121739"/>
+    <w:multiLevelType w:val="multilevel"/>
+    <w:tmpl w:val="41A82214"/>
+    <w:lvl w:ilvl="0">
+      <w:start w:val="1"/>
+      <w:numFmt w:val="bullet"/>
+      <w:lvlText w:val=""/>
+      <w:lvlJc w:val="left"/>
+      <w:pPr>
+        <w:tabs>
+          <w:tab w:val="num" w:pos="720"/>
+        </w:tabs>
+        <w:ind w:left="720" w:hanging="360"/>
+      </w:pPr>
+      <w:rPr>
+        <w:rFonts w:ascii="Symbol" w:hAnsi="Symbol" w:hint="default"/>
+        <w:sz w:val="20"/>
+      </w:rPr>
+    </w:lvl>
+    <w:lvl w:ilvl="1" w:tentative="1">
+      <w:start w:val="1"/>
+      <w:numFmt w:val="bullet"/>
+      <w:lvlText w:val="o"/>
+      <w:lvlJc w:val="left"/>
+      <w:pPr>
+        <w:tabs>
+          <w:tab w:val="num" w:pos="1440"/>
+        </w:tabs>
+        <w:ind w:left="1440" w:hanging="360"/>
+      </w:pPr>
+      <w:rPr>
+        <w:rFonts w:ascii="Courier New" w:hAnsi="Courier New" w:hint="default"/>
+        <w:sz w:val="20"/>
+      </w:rPr>
+    </w:lvl>
+    <w:lvl w:ilvl="2" w:tentative="1">
+      <w:start w:val="1"/>
+      <w:numFmt w:val="bullet"/>
+      <w:lvlText w:val=""/>
+      <w:lvlJc w:val="left"/>
+      <w:pPr>
+        <w:tabs>
+          <w:tab w:val="num" w:pos="2160"/>
+        </w:tabs>
+        <w:ind w:left="2160" w:hanging="360"/>
+      </w:pPr>
+      <w:rPr>
+        <w:rFonts w:ascii="Wingdings" w:hAnsi="Wingdings" w:hint="default"/>
+        <w:sz w:val="20"/>
+      </w:rPr>
+    </w:lvl>
+    <w:lvl w:ilvl="3" w:tentative="1">
+      <w:start w:val="1"/>
+      <w:numFmt w:val="bullet"/>
+      <w:lvlText w:val=""/>
+      <w:lvlJc w:val="left"/>
+      <w:pPr>
+        <w:tabs>
+          <w:tab w:val="num" w:pos="2880"/>
+        </w:tabs>
+        <w:ind w:left="2880" w:hanging="360"/>
+      </w:pPr>
+      <w:rPr>
+        <w:rFonts w:ascii="Wingdings" w:hAnsi="Wingdings" w:hint="default"/>
+        <w:sz w:val="20"/>
+      </w:rPr>
+    </w:lvl>
+    <w:lvl w:ilvl="4" w:tentative="1">
+      <w:start w:val="1"/>
+      <w:numFmt w:val="bullet"/>
+      <w:lvlText w:val=""/>
+      <w:lvlJc w:val="left"/>
+      <w:pPr>
+        <w:tabs>
+          <w:tab w:val="num" w:pos="3600"/>
+        </w:tabs>
+        <w:ind w:left="3600" w:hanging="360"/>
+      </w:pPr>
+      <w:rPr>
+        <w:rFonts w:ascii="Wingdings" w:hAnsi="Wingdings" w:hint="default"/>
+        <w:sz w:val="20"/>
+      </w:rPr>
+    </w:lvl>
+    <w:lvl w:ilvl="5" w:tentative="1">
+      <w:start w:val="1"/>
+      <w:numFmt w:val="bullet"/>
+      <w:lvlText w:val=""/>
+      <w:lvlJc w:val="left"/>
+      <w:pPr>
+        <w:tabs>
+          <w:tab w:val="num" w:pos="4320"/>
+        </w:tabs>
+        <w:ind w:left="4320" w:hanging="360"/>
+      </w:pPr>
+      <w:rPr>
+        <w:rFonts w:ascii="Wingdings" w:hAnsi="Wingdings" w:hint="default"/>
+        <w:sz w:val="20"/>
+      </w:rPr>
+    </w:lvl>
+    <w:lvl w:ilvl="6" w:tentative="1">
+      <w:start w:val="1"/>
+      <w:numFmt w:val="bullet"/>
+      <w:lvlText w:val=""/>
+      <w:lvlJc w:val="left"/>
+      <w:pPr>
+        <w:tabs>
+          <w:tab w:val="num" w:pos="5040"/>
+        </w:tabs>
+        <w:ind w:left="5040" w:hanging="360"/>
+      </w:pPr>
+      <w:rPr>
+        <w:rFonts w:ascii="Wingdings" w:hAnsi="Wingdings" w:hint="default"/>
+        <w:sz w:val="20"/>
+      </w:rPr>
+    </w:lvl>
+    <w:lvl w:ilvl="7" w:tentative="1">
+      <w:start w:val="1"/>
+      <w:numFmt w:val="bullet"/>
+      <w:lvlText w:val=""/>
+      <w:lvlJc w:val="left"/>
+      <w:pPr>
+        <w:tabs>
+          <w:tab w:val="num" w:pos="5760"/>
+        </w:tabs>
+        <w:ind w:left="5760" w:hanging="360"/>
+      </w:pPr>
+      <w:rPr>
+        <w:rFonts w:ascii="Wingdings" w:hAnsi="Wingdings" w:hint="default"/>
+        <w:sz w:val="20"/>
+      </w:rPr>
+    </w:lvl>
+    <w:lvl w:ilvl="8" w:tentative="1">
+      <w:start w:val="1"/>
+      <w:numFmt w:val="bullet"/>
+      <w:lvlText w:val=""/>
+      <w:lvlJc w:val="left"/>
+      <w:pPr>
+        <w:tabs>
+          <w:tab w:val="num" w:pos="6480"/>
+        </w:tabs>
+        <w:ind w:left="6480" w:hanging="360"/>
+      </w:pPr>
+      <w:rPr>
+        <w:rFonts w:ascii="Wingdings" w:hAnsi="Wingdings" w:hint="default"/>
+        <w:sz w:val="20"/>
+      </w:rPr>
+    </w:lvl>
+  </w:abstractNum>
+  <w:abstractNum w:abstractNumId="4" w15:restartNumberingAfterBreak="0">
+    <w:nsid w:val="40D3271D"/>
+    <w:multiLevelType w:val="multilevel"/>
+    <w:tmpl w:val="7F902AB2"/>
+    <w:lvl w:ilvl="0">
+      <w:start w:val="1"/>
+      <w:numFmt w:val="bullet"/>
+      <w:lvlText w:val=""/>
+      <w:lvlJc w:val="left"/>
+      <w:pPr>
+        <w:tabs>
+          <w:tab w:val="num" w:pos="720"/>
+        </w:tabs>
+        <w:ind w:left="720" w:hanging="360"/>
+      </w:pPr>
+      <w:rPr>
+        <w:rFonts w:ascii="Symbol" w:hAnsi="Symbol" w:hint="default"/>
+        <w:sz w:val="20"/>
+      </w:rPr>
+    </w:lvl>
+    <w:lvl w:ilvl="1" w:tentative="1">
+      <w:start w:val="1"/>
+      <w:numFmt w:val="bullet"/>
+      <w:lvlText w:val="o"/>
+      <w:lvlJc w:val="left"/>
+      <w:pPr>
+        <w:tabs>
+          <w:tab w:val="num" w:pos="1440"/>
+        </w:tabs>
+        <w:ind w:left="1440" w:hanging="360"/>
+      </w:pPr>
+      <w:rPr>
+        <w:rFonts w:ascii="Courier New" w:hAnsi="Courier New" w:hint="default"/>
+        <w:sz w:val="20"/>
+      </w:rPr>
+    </w:lvl>
+    <w:lvl w:ilvl="2" w:tentative="1">
+      <w:start w:val="1"/>
+      <w:numFmt w:val="bullet"/>
+      <w:lvlText w:val=""/>
+      <w:lvlJc w:val="left"/>
+      <w:pPr>
+        <w:tabs>
+          <w:tab w:val="num" w:pos="2160"/>
+        </w:tabs>
+        <w:ind w:left="2160" w:hanging="360"/>
+      </w:pPr>
+      <w:rPr>
+        <w:rFonts w:ascii="Wingdings" w:hAnsi="Wingdings" w:hint="default"/>
+        <w:sz w:val="20"/>
+      </w:rPr>
+    </w:lvl>
+    <w:lvl w:ilvl="3" w:tentative="1">
+      <w:start w:val="1"/>
+      <w:numFmt w:val="bullet"/>
+      <w:lvlText w:val=""/>
+      <w:lvlJc w:val="left"/>
+      <w:pPr>
+        <w:tabs>
+          <w:tab w:val="num" w:pos="2880"/>
+        </w:tabs>
+        <w:ind w:left="2880" w:hanging="360"/>
+      </w:pPr>
+      <w:rPr>
+        <w:rFonts w:ascii="Wingdings" w:hAnsi="Wingdings" w:hint="default"/>
+        <w:sz w:val="20"/>
+      </w:rPr>
+    </w:lvl>
+    <w:lvl w:ilvl="4" w:tentative="1">
+      <w:start w:val="1"/>
+      <w:numFmt w:val="bullet"/>
+      <w:lvlText w:val=""/>
+      <w:lvlJc w:val="left"/>
+      <w:pPr>
+        <w:tabs>
+          <w:tab w:val="num" w:pos="3600"/>
+        </w:tabs>
+        <w:ind w:left="3600" w:hanging="360"/>
+      </w:pPr>
+      <w:rPr>
+        <w:rFonts w:ascii="Wingdings" w:hAnsi="Wingdings" w:hint="default"/>
+        <w:sz w:val="20"/>
+      </w:rPr>
+    </w:lvl>
+    <w:lvl w:ilvl="5" w:tentative="1">
+      <w:start w:val="1"/>
+      <w:numFmt w:val="bullet"/>
+      <w:lvlText w:val=""/>
+      <w:lvlJc w:val="left"/>
+      <w:pPr>
+        <w:tabs>
+          <w:tab w:val="num" w:pos="4320"/>
+        </w:tabs>
+        <w:ind w:left="4320" w:hanging="360"/>
+      </w:pPr>
+      <w:rPr>
+        <w:rFonts w:ascii="Wingdings" w:hAnsi="Wingdings" w:hint="default"/>
+        <w:sz w:val="20"/>
+      </w:rPr>
+    </w:lvl>
+    <w:lvl w:ilvl="6" w:tentative="1">
+      <w:start w:val="1"/>
+      <w:numFmt w:val="bullet"/>
+      <w:lvlText w:val=""/>
+      <w:lvlJc w:val="left"/>
+      <w:pPr>
+        <w:tabs>
+          <w:tab w:val="num" w:pos="5040"/>
+        </w:tabs>
+        <w:ind w:left="5040" w:hanging="360"/>
+      </w:pPr>
+      <w:rPr>
+        <w:rFonts w:ascii="Wingdings" w:hAnsi="Wingdings" w:hint="default"/>
+        <w:sz w:val="20"/>
+      </w:rPr>
+    </w:lvl>
+    <w:lvl w:ilvl="7" w:tentative="1">
+      <w:start w:val="1"/>
+      <w:numFmt w:val="bullet"/>
+      <w:lvlText w:val=""/>
+      <w:lvlJc w:val="left"/>
+      <w:pPr>
+        <w:tabs>
+          <w:tab w:val="num" w:pos="5760"/>
+        </w:tabs>
+        <w:ind w:left="5760" w:hanging="360"/>
+      </w:pPr>
+      <w:rPr>
+        <w:rFonts w:ascii="Wingdings" w:hAnsi="Wingdings" w:hint="default"/>
+        <w:sz w:val="20"/>
+      </w:rPr>
+    </w:lvl>
+    <w:lvl w:ilvl="8" w:tentative="1">
+      <w:start w:val="1"/>
+      <w:numFmt w:val="bullet"/>
+      <w:lvlText w:val=""/>
+      <w:lvlJc w:val="left"/>
+      <w:pPr>
+        <w:tabs>
+          <w:tab w:val="num" w:pos="6480"/>
+        </w:tabs>
+        <w:ind w:left="6480" w:hanging="360"/>
+      </w:pPr>
+      <w:rPr>
+        <w:rFonts w:ascii="Wingdings" w:hAnsi="Wingdings" w:hint="default"/>
+        <w:sz w:val="20"/>
+      </w:rPr>
+    </w:lvl>
+  </w:abstractNum>
+  <w:abstractNum w:abstractNumId="5" w15:restartNumberingAfterBreak="0">
+    <w:nsid w:val="65472E02"/>
+    <w:multiLevelType w:val="multilevel"/>
+    <w:tmpl w:val="6972A770"/>
+    <w:lvl w:ilvl="0">
+      <w:start w:val="1"/>
+      <w:numFmt w:val="bullet"/>
+      <w:lvlText w:val=""/>
+      <w:lvlJc w:val="left"/>
+      <w:pPr>
+        <w:tabs>
+          <w:tab w:val="num" w:pos="720"/>
+        </w:tabs>
+        <w:ind w:left="720" w:hanging="360"/>
+      </w:pPr>
+      <w:rPr>
+        <w:rFonts w:ascii="Symbol" w:hAnsi="Symbol" w:hint="default"/>
+        <w:sz w:val="20"/>
+      </w:rPr>
+    </w:lvl>
+    <w:lvl w:ilvl="1" w:tentative="1">
+      <w:start w:val="1"/>
+      <w:numFmt w:val="bullet"/>
+      <w:lvlText w:val="o"/>
+      <w:lvlJc w:val="left"/>
+      <w:pPr>
+        <w:tabs>
+          <w:tab w:val="num" w:pos="1440"/>
+        </w:tabs>
+        <w:ind w:left="1440" w:hanging="360"/>
+      </w:pPr>
+      <w:rPr>
+        <w:rFonts w:ascii="Courier New" w:hAnsi="Courier New" w:hint="default"/>
+        <w:sz w:val="20"/>
+      </w:rPr>
+    </w:lvl>
+    <w:lvl w:ilvl="2" w:tentative="1">
+      <w:start w:val="1"/>
+      <w:numFmt w:val="bullet"/>
+      <w:lvlText w:val=""/>
+      <w:lvlJc w:val="left"/>
+      <w:pPr>
+        <w:tabs>
+          <w:tab w:val="num" w:pos="2160"/>
+        </w:tabs>
+        <w:ind w:left="2160" w:hanging="360"/>
+      </w:pPr>
+      <w:rPr>
+        <w:rFonts w:ascii="Wingdings" w:hAnsi="Wingdings" w:hint="default"/>
+        <w:sz w:val="20"/>
+      </w:rPr>
+    </w:lvl>
+    <w:lvl w:ilvl="3" w:tentative="1">
+      <w:start w:val="1"/>
+      <w:numFmt w:val="bullet"/>
+      <w:lvlText w:val=""/>
+      <w:lvlJc w:val="left"/>
+      <w:pPr>
+        <w:tabs>
+          <w:tab w:val="num" w:pos="2880"/>
+        </w:tabs>
+        <w:ind w:left="2880" w:hanging="360"/>
+      </w:pPr>
+      <w:rPr>
+        <w:rFonts w:ascii="Wingdings" w:hAnsi="Wingdings" w:hint="default"/>
+        <w:sz w:val="20"/>
+      </w:rPr>
+    </w:lvl>
+    <w:lvl w:ilvl="4" w:tentative="1">
+      <w:start w:val="1"/>
+      <w:numFmt w:val="bullet"/>
+      <w:lvlText w:val=""/>
+      <w:lvlJc w:val="left"/>
+      <w:pPr>
+        <w:tabs>
+          <w:tab w:val="num" w:pos="3600"/>
+        </w:tabs>
+        <w:ind w:left="3600" w:hanging="360"/>
+      </w:pPr>
+      <w:rPr>
+        <w:rFonts w:ascii="Wingdings" w:hAnsi="Wingdings" w:hint="default"/>
+        <w:sz w:val="20"/>
+      </w:rPr>
+    </w:lvl>
+    <w:lvl w:ilvl="5" w:tentative="1">
+      <w:start w:val="1"/>
+      <w:numFmt w:val="bullet"/>
+      <w:lvlText w:val=""/>
+      <w:lvlJc w:val="left"/>
+      <w:pPr>
+        <w:tabs>
+          <w:tab w:val="num" w:pos="4320"/>
+        </w:tabs>
+        <w:ind w:left="4320" w:hanging="360"/>
+      </w:pPr>
+      <w:rPr>
+        <w:rFonts w:ascii="Wingdings" w:hAnsi="Wingdings" w:hint="default"/>
+        <w:sz w:val="20"/>
+      </w:rPr>
+    </w:lvl>
+    <w:lvl w:ilvl="6" w:tentative="1">
+      <w:start w:val="1"/>
+      <w:numFmt w:val="bullet"/>
+      <w:lvlText w:val=""/>
+      <w:lvlJc w:val="left"/>
+      <w:pPr>
+        <w:tabs>
+          <w:tab w:val="num" w:pos="5040"/>
+        </w:tabs>
+        <w:ind w:left="5040" w:hanging="360"/>
+      </w:pPr>
+      <w:rPr>
+        <w:rFonts w:ascii="Wingdings" w:hAnsi="Wingdings" w:hint="default"/>
+        <w:sz w:val="20"/>
+      </w:rPr>
+    </w:lvl>
+    <w:lvl w:ilvl="7" w:tentative="1">
+      <w:start w:val="1"/>
+      <w:numFmt w:val="bullet"/>
+      <w:lvlText w:val=""/>
+      <w:lvlJc w:val="left"/>
+      <w:pPr>
+        <w:tabs>
+          <w:tab w:val="num" w:pos="5760"/>
+        </w:tabs>
+        <w:ind w:left="5760" w:hanging="360"/>
+      </w:pPr>
+      <w:rPr>
+        <w:rFonts w:ascii="Wingdings" w:hAnsi="Wingdings" w:hint="default"/>
+        <w:sz w:val="20"/>
+      </w:rPr>
+    </w:lvl>
+    <w:lvl w:ilvl="8" w:tentative="1">
+      <w:start w:val="1"/>
+      <w:numFmt w:val="bullet"/>
+      <w:lvlText w:val=""/>
+      <w:lvlJc w:val="left"/>
+      <w:pPr>
+        <w:tabs>
+          <w:tab w:val="num" w:pos="6480"/>
+        </w:tabs>
+        <w:ind w:left="6480" w:hanging="360"/>
+      </w:pPr>
+      <w:rPr>
+        <w:rFonts w:ascii="Wingdings" w:hAnsi="Wingdings" w:hint="default"/>
+        <w:sz w:val="20"/>
+      </w:rPr>
+    </w:lvl>
+  </w:abstractNum>
+  <w:abstractNum w:abstractNumId="6" w15:restartNumberingAfterBreak="0">
+    <w:nsid w:val="6B666AB3"/>
+    <w:multiLevelType w:val="multilevel"/>
+    <w:tmpl w:val="6B26041E"/>
+    <w:lvl w:ilvl="0">
+      <w:start w:val="1"/>
+      <w:numFmt w:val="bullet"/>
+      <w:lvlText w:val=""/>
+      <w:lvlJc w:val="left"/>
+      <w:pPr>
+        <w:tabs>
+          <w:tab w:val="num" w:pos="720"/>
+        </w:tabs>
+        <w:ind w:left="720" w:hanging="360"/>
+      </w:pPr>
+      <w:rPr>
+        <w:rFonts w:ascii="Symbol" w:hAnsi="Symbol" w:hint="default"/>
+        <w:sz w:val="20"/>
+      </w:rPr>
+    </w:lvl>
+    <w:lvl w:ilvl="1" w:tentative="1">
+      <w:start w:val="1"/>
+      <w:numFmt w:val="bullet"/>
+      <w:lvlText w:val="o"/>
+      <w:lvlJc w:val="left"/>
+      <w:pPr>
+        <w:tabs>
+          <w:tab w:val="num" w:pos="1440"/>
+        </w:tabs>
+        <w:ind w:left="1440" w:hanging="360"/>
+      </w:pPr>
+      <w:rPr>
+        <w:rFonts w:ascii="Courier New" w:hAnsi="Courier New" w:hint="default"/>
+        <w:sz w:val="20"/>
+      </w:rPr>
+    </w:lvl>
+    <w:lvl w:ilvl="2" w:tentative="1">
+      <w:start w:val="1"/>
+      <w:numFmt w:val="bullet"/>
+      <w:lvlText w:val=""/>
+      <w:lvlJc w:val="left"/>
+      <w:pPr>
+        <w:tabs>
+          <w:tab w:val="num" w:pos="2160"/>
+        </w:tabs>
+        <w:ind w:left="2160" w:hanging="360"/>
+      </w:pPr>
+      <w:rPr>
+        <w:rFonts w:ascii="Wingdings" w:hAnsi="Wingdings" w:hint="default"/>
+        <w:sz w:val="20"/>
+      </w:rPr>
+    </w:lvl>
+    <w:lvl w:ilvl="3" w:tentative="1">
+      <w:start w:val="1"/>
+      <w:numFmt w:val="bullet"/>
+      <w:lvlText w:val=""/>
+      <w:lvlJc w:val="left"/>
+      <w:pPr>
+        <w:tabs>
+          <w:tab w:val="num" w:pos="2880"/>
+        </w:tabs>
+        <w:ind w:left="2880" w:hanging="360"/>
+      </w:pPr>
+      <w:rPr>
+        <w:rFonts w:ascii="Wingdings" w:hAnsi="Wingdings" w:hint="default"/>
+        <w:sz w:val="20"/>
+      </w:rPr>
+    </w:lvl>
+    <w:lvl w:ilvl="4" w:tentative="1">
+      <w:start w:val="1"/>
+      <w:numFmt w:val="bullet"/>
+      <w:lvlText w:val=""/>
+      <w:lvlJc w:val="left"/>
+      <w:pPr>
+        <w:tabs>
+          <w:tab w:val="num" w:pos="3600"/>
+        </w:tabs>
+        <w:ind w:left="3600" w:hanging="360"/>
+      </w:pPr>
+      <w:rPr>
+        <w:rFonts w:ascii="Wingdings" w:hAnsi="Wingdings" w:hint="default"/>
+        <w:sz w:val="20"/>
+      </w:rPr>
+    </w:lvl>
+    <w:lvl w:ilvl="5" w:tentative="1">
+      <w:start w:val="1"/>
+      <w:numFmt w:val="bullet"/>
+      <w:lvlText w:val=""/>
+      <w:lvlJc w:val="left"/>
+      <w:pPr>
+        <w:tabs>
+          <w:tab w:val="num" w:pos="4320"/>
+        </w:tabs>
+        <w:ind w:left="4320" w:hanging="360"/>
+      </w:pPr>
+      <w:rPr>
+        <w:rFonts w:ascii="Wingdings" w:hAnsi="Wingdings" w:hint="default"/>
+        <w:sz w:val="20"/>
+      </w:rPr>
+    </w:lvl>
+    <w:lvl w:ilvl="6" w:tentative="1">
+      <w:start w:val="1"/>
+      <w:numFmt w:val="bullet"/>
+      <w:lvlText w:val=""/>
+      <w:lvlJc w:val="left"/>
+      <w:pPr>
+        <w:tabs>
+          <w:tab w:val="num" w:pos="5040"/>
+        </w:tabs>
+        <w:ind w:left="5040" w:hanging="360"/>
+      </w:pPr>
+      <w:rPr>
+        <w:rFonts w:ascii="Wingdings" w:hAnsi="Wingdings" w:hint="default"/>
+        <w:sz w:val="20"/>
+      </w:rPr>
+    </w:lvl>
+    <w:lvl w:ilvl="7" w:tentative="1">
+      <w:start w:val="1"/>
+      <w:numFmt w:val="bullet"/>
+      <w:lvlText w:val=""/>
+      <w:lvlJc w:val="left"/>
+      <w:pPr>
+        <w:tabs>
+          <w:tab w:val="num" w:pos="5760"/>
+        </w:tabs>
+        <w:ind w:left="5760" w:hanging="360"/>
+      </w:pPr>
+      <w:rPr>
+        <w:rFonts w:ascii="Wingdings" w:hAnsi="Wingdings" w:hint="default"/>
+        <w:sz w:val="20"/>
+      </w:rPr>
+    </w:lvl>
+    <w:lvl w:ilvl="8" w:tentative="1">
+      <w:start w:val="1"/>
+      <w:numFmt w:val="bullet"/>
+      <w:lvlText w:val=""/>
+      <w:lvlJc w:val="left"/>
+      <w:pPr>
+        <w:tabs>
+          <w:tab w:val="num" w:pos="6480"/>
+        </w:tabs>
+        <w:ind w:left="6480" w:hanging="360"/>
+      </w:pPr>
+      <w:rPr>
+        <w:rFonts w:ascii="Wingdings" w:hAnsi="Wingdings" w:hint="default"/>
+        <w:sz w:val="20"/>
+      </w:rPr>
+    </w:lvl>
+  </w:abstractNum>
+  <w:abstractNum w:abstractNumId="7" w15:restartNumberingAfterBreak="0">
     <w:nsid w:val="77E26C5F"/>
     <w:multiLevelType w:val="hybridMultilevel"/>
     <w:tmpl w:val="F80EB8A0"/>
@@ -1333,14 +2278,181 @@
       </w:rPr>
     </w:lvl>
   </w:abstractNum>
+  <w:abstractNum w:abstractNumId="8" w15:restartNumberingAfterBreak="0">
+    <w:nsid w:val="7BBF1902"/>
+    <w:multiLevelType w:val="multilevel"/>
+    <w:tmpl w:val="4E78EA08"/>
+    <w:lvl w:ilvl="0">
+      <w:start w:val="1"/>
+      <w:numFmt w:val="bullet"/>
+      <w:lvlText w:val=""/>
+      <w:lvlJc w:val="left"/>
+      <w:pPr>
+        <w:tabs>
+          <w:tab w:val="num" w:pos="720"/>
+        </w:tabs>
+        <w:ind w:left="720" w:hanging="360"/>
+      </w:pPr>
+      <w:rPr>
+        <w:rFonts w:ascii="Symbol" w:hAnsi="Symbol" w:hint="default"/>
+        <w:sz w:val="20"/>
+      </w:rPr>
+    </w:lvl>
+    <w:lvl w:ilvl="1" w:tentative="1">
+      <w:start w:val="1"/>
+      <w:numFmt w:val="bullet"/>
+      <w:lvlText w:val="o"/>
+      <w:lvlJc w:val="left"/>
+      <w:pPr>
+        <w:tabs>
+          <w:tab w:val="num" w:pos="1440"/>
+        </w:tabs>
+        <w:ind w:left="1440" w:hanging="360"/>
+      </w:pPr>
+      <w:rPr>
+        <w:rFonts w:ascii="Courier New" w:hAnsi="Courier New" w:hint="default"/>
+        <w:sz w:val="20"/>
+      </w:rPr>
+    </w:lvl>
+    <w:lvl w:ilvl="2" w:tentative="1">
+      <w:start w:val="1"/>
+      <w:numFmt w:val="bullet"/>
+      <w:lvlText w:val=""/>
+      <w:lvlJc w:val="left"/>
+      <w:pPr>
+        <w:tabs>
+          <w:tab w:val="num" w:pos="2160"/>
+        </w:tabs>
+        <w:ind w:left="2160" w:hanging="360"/>
+      </w:pPr>
+      <w:rPr>
+        <w:rFonts w:ascii="Wingdings" w:hAnsi="Wingdings" w:hint="default"/>
+        <w:sz w:val="20"/>
+      </w:rPr>
+    </w:lvl>
+    <w:lvl w:ilvl="3" w:tentative="1">
+      <w:start w:val="1"/>
+      <w:numFmt w:val="bullet"/>
+      <w:lvlText w:val=""/>
+      <w:lvlJc w:val="left"/>
+      <w:pPr>
+        <w:tabs>
+          <w:tab w:val="num" w:pos="2880"/>
+        </w:tabs>
+        <w:ind w:left="2880" w:hanging="360"/>
+      </w:pPr>
+      <w:rPr>
+        <w:rFonts w:ascii="Wingdings" w:hAnsi="Wingdings" w:hint="default"/>
+        <w:sz w:val="20"/>
+      </w:rPr>
+    </w:lvl>
+    <w:lvl w:ilvl="4" w:tentative="1">
+      <w:start w:val="1"/>
+      <w:numFmt w:val="bullet"/>
+      <w:lvlText w:val=""/>
+      <w:lvlJc w:val="left"/>
+      <w:pPr>
+        <w:tabs>
+          <w:tab w:val="num" w:pos="3600"/>
+        </w:tabs>
+        <w:ind w:left="3600" w:hanging="360"/>
+      </w:pPr>
+      <w:rPr>
+        <w:rFonts w:ascii="Wingdings" w:hAnsi="Wingdings" w:hint="default"/>
+        <w:sz w:val="20"/>
+      </w:rPr>
+    </w:lvl>
+    <w:lvl w:ilvl="5" w:tentative="1">
+      <w:start w:val="1"/>
+      <w:numFmt w:val="bullet"/>
+      <w:lvlText w:val=""/>
+      <w:lvlJc w:val="left"/>
+      <w:pPr>
+        <w:tabs>
+          <w:tab w:val="num" w:pos="4320"/>
+        </w:tabs>
+        <w:ind w:left="4320" w:hanging="360"/>
+      </w:pPr>
+      <w:rPr>
+        <w:rFonts w:ascii="Wingdings" w:hAnsi="Wingdings" w:hint="default"/>
+        <w:sz w:val="20"/>
+      </w:rPr>
+    </w:lvl>
+    <w:lvl w:ilvl="6" w:tentative="1">
+      <w:start w:val="1"/>
+      <w:numFmt w:val="bullet"/>
+      <w:lvlText w:val=""/>
+      <w:lvlJc w:val="left"/>
+      <w:pPr>
+        <w:tabs>
+          <w:tab w:val="num" w:pos="5040"/>
+        </w:tabs>
+        <w:ind w:left="5040" w:hanging="360"/>
+      </w:pPr>
+      <w:rPr>
+        <w:rFonts w:ascii="Wingdings" w:hAnsi="Wingdings" w:hint="default"/>
+        <w:sz w:val="20"/>
+      </w:rPr>
+    </w:lvl>
+    <w:lvl w:ilvl="7" w:tentative="1">
+      <w:start w:val="1"/>
+      <w:numFmt w:val="bullet"/>
+      <w:lvlText w:val=""/>
+      <w:lvlJc w:val="left"/>
+      <w:pPr>
+        <w:tabs>
+          <w:tab w:val="num" w:pos="5760"/>
+        </w:tabs>
+        <w:ind w:left="5760" w:hanging="360"/>
+      </w:pPr>
+      <w:rPr>
+        <w:rFonts w:ascii="Wingdings" w:hAnsi="Wingdings" w:hint="default"/>
+        <w:sz w:val="20"/>
+      </w:rPr>
+    </w:lvl>
+    <w:lvl w:ilvl="8" w:tentative="1">
+      <w:start w:val="1"/>
+      <w:numFmt w:val="bullet"/>
+      <w:lvlText w:val=""/>
+      <w:lvlJc w:val="left"/>
+      <w:pPr>
+        <w:tabs>
+          <w:tab w:val="num" w:pos="6480"/>
+        </w:tabs>
+        <w:ind w:left="6480" w:hanging="360"/>
+      </w:pPr>
+      <w:rPr>
+        <w:rFonts w:ascii="Wingdings" w:hAnsi="Wingdings" w:hint="default"/>
+        <w:sz w:val="20"/>
+      </w:rPr>
+    </w:lvl>
+  </w:abstractNum>
   <w:num w:numId="1" w16cid:durableId="1090003291">
-    <w:abstractNumId w:val="2"/>
+    <w:abstractNumId w:val="7"/>
   </w:num>
   <w:num w:numId="2" w16cid:durableId="436215958">
-    <w:abstractNumId w:val="1"/>
+    <w:abstractNumId w:val="2"/>
   </w:num>
   <w:num w:numId="3" w16cid:durableId="795678584">
     <w:abstractNumId w:val="0"/>
+  </w:num>
+  <w:num w:numId="4" w16cid:durableId="699935305">
+    <w:abstractNumId w:val="6"/>
+  </w:num>
+  <w:num w:numId="5" w16cid:durableId="2060857173">
+    <w:abstractNumId w:val="8"/>
+  </w:num>
+  <w:num w:numId="6" w16cid:durableId="494686804">
+    <w:abstractNumId w:val="1"/>
+  </w:num>
+  <w:num w:numId="7" w16cid:durableId="1638753848">
+    <w:abstractNumId w:val="3"/>
+  </w:num>
+  <w:num w:numId="8" w16cid:durableId="453909427">
+    <w:abstractNumId w:val="4"/>
+  </w:num>
+  <w:num w:numId="9" w16cid:durableId="326323758">
+    <w:abstractNumId w:val="5"/>
   </w:num>
 </w:numbering>
 </file>

</xml_diff>

<commit_message>
cod + alte articole recenzate
</commit_message>
<xml_diff>
--- a/text/3.literatura_de_specialitate/Literatura_de_specialitate.docx
+++ b/text/3.literatura_de_specialitate/Literatura_de_specialitate.docx
@@ -1046,73 +1046,191 @@
         <w:t>de natură umană</w:t>
       </w:r>
       <w:r>
+        <w:t>,</w:t>
+      </w:r>
+      <w:r>
+        <w:t xml:space="preserve"> </w:t>
+      </w:r>
+      <w:r>
+        <w:t xml:space="preserve"> </w:t>
+      </w:r>
+      <w:r>
+        <w:t>colaborarea în echipă, comunicarea și gândirea critică.</w:t>
+      </w:r>
+      <w:r>
+        <w:t xml:space="preserve"> Printre aceste locuri de muncă se numără</w:t>
+      </w:r>
+      <w:r>
+        <w:t xml:space="preserve"> pozițiile de gestionare a resurselor și pozițiile de conducer</w:t>
+      </w:r>
+      <w:r>
+        <w:t xml:space="preserve">e. </w:t>
+      </w:r>
+      <w:r>
+        <w:t xml:space="preserve">Persoanele care lucrează în fabrică sau </w:t>
+      </w:r>
+      <w:r>
+        <w:t>cele</w:t>
+      </w:r>
+      <w:r>
+        <w:t xml:space="preserve"> care</w:t>
+      </w:r>
+      <w:r>
+        <w:t xml:space="preserve"> prezintă dizabilități </w:t>
+      </w:r>
+      <w:r>
+        <w:t xml:space="preserve"> </w:t>
+      </w:r>
+      <w:r>
+        <w:t>sunt mult mai expuse la acest risc al integrării inteligenței artificiale în procesul de muncă</w:t>
+      </w:r>
+      <w:r>
+        <w:t>, conform articolului.</w:t>
+      </w:r>
+      <w:r>
+        <w:t xml:space="preserve"> </w:t>
+      </w:r>
+      <w:r>
+        <w:t>De asemenea, autorul prezintă câteva dintre sectoarele economice unde integrarea sistemului de inteligență artificială aduce schimbări. În domeniul de fabricație, sisteme de automatizare a controlului calității și de gestionare a stocului îmbunătățesc productivitatea și scad costurile.</w:t>
+      </w:r>
+      <w:r>
+        <w:t xml:space="preserve"> Articolul aduce la cunoștință </w:t>
+      </w:r>
+      <w:r>
+        <w:t>cu sistemele inteligente sunt folosite și în domeniul bancar pentru a evalua riscurile și pentru a facilita procesul de decizie</w:t>
+      </w:r>
+      <w:r>
+        <w:t xml:space="preserve"> pentru investiții.</w:t>
+      </w:r>
+      <w:r>
+        <w:t xml:space="preserve"> Pentru o privire de ansamblu, datele statistice prezentate în lucrare arată că, în 2021 8% din totalul afacerilor din Uniunea Europeană au integrat inteligența artificială, iar 28% din companiile mari au adoptat această tehnologie.</w:t>
+      </w:r>
+      <w:r>
+        <w:t xml:space="preserve"> Predominant este sectorul IT, unde 25% dintre companii au optat pentru utilizarea acestor inovații, iar sectorul construcțiilor și al transporturilor au avut cel mai mic procentaj de adopție, în proporție de 5%. </w:t>
+      </w:r>
+    </w:p>
+    <w:p>
+      <w:pPr>
+        <w:rPr>
+          <w:u w:val="single"/>
+        </w:rPr>
+      </w:pPr>
+      <w:r>
+        <w:rPr>
+          <w:u w:val="single"/>
+        </w:rPr>
+        <w:t>Lipsa forței de muncă calificată și aspirațiile migraționale</w:t>
+      </w:r>
+    </w:p>
+    <w:p>
+      <w:r>
+        <w:tab/>
+      </w:r>
+      <w:r>
+        <w:t xml:space="preserve">După cum este indicat și în articolele mai sus menționate, piața forței de muncă suferă modificări rapide, iar acest aspect reiese și din analiza tendințelor de migrație. Așadar, în lucrarea “Linking workers’ migration aspirations to skill shortages in destination and origin countries” (2024) </w:t>
+      </w:r>
+      <w:r>
+        <w:t xml:space="preserve">se </w:t>
+      </w:r>
+      <w:r>
+        <w:t>prezintă legăturile dintre migrația cetățenilor din Albania, Serbia, Bosnia și Herțegovina și deficitul forței de muncă</w:t>
+      </w:r>
+      <w:r>
+        <w:t>, luând în considerare aspirațiile indivizilor.</w:t>
+      </w:r>
+      <w:r>
+        <w:t xml:space="preserve"> Analiza </w:t>
+      </w:r>
+      <w:r>
+        <w:t>realizată în lucrare indică faptul că odată cu înaintarea în vârstă tendința de a migra scade un 1.1%, în fiecare an.</w:t>
+      </w:r>
+      <w:r>
+        <w:t xml:space="preserve"> În contrast, dacă numărul persoanelor care </w:t>
+      </w:r>
+      <w:r>
+        <w:t>conviețuiesc</w:t>
+      </w:r>
+      <w:r>
+        <w:t xml:space="preserve"> într-o locuință crește, atunci probabilitatea de migrație crește cu 2.2%</w:t>
+      </w:r>
+      <w:r>
+        <w:t>, la fiecare creștere cu o unitate</w:t>
+      </w:r>
+      <w:r>
+        <w:t xml:space="preserve"> </w:t>
+      </w:r>
+      <w:r>
+        <w:t xml:space="preserve">. Autorii evidențiază că în cazul în care există o lipsă semnificativă de forță de muncă </w:t>
+      </w:r>
+      <w:r>
+        <w:t>cu experiență</w:t>
+      </w:r>
+      <w:r>
+        <w:t>, atunci indivizii din acest grup de țări sunt mai puțin înclinați să se mute într-o altă țară, scăzând probabilitatea cu 38,2% față de situația existenței forței de muncă.</w:t>
+      </w:r>
+      <w:r>
+        <w:t xml:space="preserve"> În ceea ce privește țara destinație, autorii au identificat Germania ca fiind una dintre alegerile cele mai întâlnite. Un alt aspect observat </w:t>
+      </w:r>
+      <w:r>
+        <w:t xml:space="preserve">din analiză  este </w:t>
+      </w:r>
+      <w:r>
+        <w:t xml:space="preserve">faptul că o familie mai numeroasă este dispusă să se mute </w:t>
+      </w:r>
+      <w:r>
+        <w:t xml:space="preserve">mai degrabă în </w:t>
+      </w:r>
+      <w:r>
+        <w:t xml:space="preserve"> Austria</w:t>
+      </w:r>
+      <w:r>
+        <w:t xml:space="preserve"> față de Germania, probabilitatea crescând cu </w:t>
+      </w:r>
+      <w:r>
+        <w:lastRenderedPageBreak/>
+        <w:t>53%.</w:t>
+      </w:r>
+      <w:r>
+        <w:t xml:space="preserve"> De asemenea, este adusă la lumină, ideea că persoanele cu calificări înalte tind să rămână în țară, comparativ cu persoanele cu calificare medie, cum ar fi funcționarii sau muncitorii, această sector având o dorință puternică de a emigra. Din această observație, autorii punctează că lipsa forței de muncă este </w:t>
+      </w:r>
+      <w:r>
+        <w:t xml:space="preserve">datorată majoritar faptului că nu există doritori, față de preconcepție </w:t>
+      </w:r>
+      <w:r>
+        <w:t>așteptată</w:t>
+      </w:r>
+      <w:r>
+        <w:t>, care sugerează că posturile vacante  ar trebui sa fie atractive pentru oameni</w:t>
+      </w:r>
+      <w:r>
+        <w:t xml:space="preserve">. </w:t>
+      </w:r>
+      <w:r>
+        <w:t>Cercetarea autorilor confirmă</w:t>
+      </w:r>
+      <w:r>
+        <w:t xml:space="preserve"> </w:t>
+      </w:r>
+      <w:r>
+        <w:t xml:space="preserve">că </w:t>
+      </w:r>
+      <w:r>
+        <w:t xml:space="preserve">faptul că factorii de tip </w:t>
+      </w:r>
+      <w:r>
         <w:rPr>
           <w:lang w:val="en-US"/>
         </w:rPr>
-        <w:t>,</w:t>
-      </w:r>
-      <w:r>
-        <w:rPr>
-          <w:lang w:val="en-US"/>
-        </w:rPr>
-        <w:t xml:space="preserve"> </w:t>
-      </w:r>
-      <w:r>
-        <w:t xml:space="preserve"> </w:t>
-      </w:r>
-      <w:r>
-        <w:t>colaborarea în echipă, comunicarea și gândirea critică.</w:t>
-      </w:r>
-      <w:r>
-        <w:t xml:space="preserve"> Printre aceste locuri de muncă se numără</w:t>
-      </w:r>
-      <w:r>
-        <w:t xml:space="preserve"> pozițiile de gestionare a resurselor și pozițiile de conducer</w:t>
-      </w:r>
-      <w:r>
-        <w:t xml:space="preserve">e. </w:t>
-      </w:r>
-      <w:r>
-        <w:t xml:space="preserve">Persoanele care lucrează în fabrică sau </w:t>
-      </w:r>
-      <w:r>
-        <w:t>cele</w:t>
-      </w:r>
-      <w:r>
-        <w:t xml:space="preserve"> care</w:t>
-      </w:r>
-      <w:r>
-        <w:t xml:space="preserve"> prezintă dizabilități </w:t>
-      </w:r>
-      <w:r>
-        <w:t xml:space="preserve"> </w:t>
-      </w:r>
-      <w:r>
-        <w:t>sunt mult mai expuse la acest risc al integrării inteligenței artificiale în procesul de muncă</w:t>
-      </w:r>
-      <w:r>
-        <w:t>, conform articolului.</w:t>
-      </w:r>
-      <w:r>
-        <w:t xml:space="preserve"> </w:t>
-      </w:r>
-      <w:r>
-        <w:t>De asemenea, autorul prezintă câteva dintre sectoarele economice unde integrarea sistemului de inteligență artificială aduce schimbări. În domeniul de fabricație, sisteme de automatizare a controlului calității și de gestionare a stocului îmbunătățesc productivitatea și scad costurile.</w:t>
-      </w:r>
-      <w:r>
-        <w:t xml:space="preserve"> Articolul aduce la cunoștință </w:t>
-      </w:r>
-      <w:r>
-        <w:t>cu sistemele inteligente sunt folosite și în domeniul bancar pentru a evalua riscurile și pentru a facilita procesul de decizie</w:t>
-      </w:r>
-      <w:r>
-        <w:t xml:space="preserve"> pentru investiții.</w:t>
-      </w:r>
-      <w:r>
-        <w:t xml:space="preserve"> Pentru o privire de ansamblu, datele statistice prezentate în lucrare arată că, în 2021 8% din totalul afacerilor din Uniunea Europeană au integrat inteligența artificială, iar 28% din companiile mari au adoptat această tehnologie.</w:t>
-      </w:r>
-      <w:r>
-        <w:t xml:space="preserve"> Predominant este sectorul IT, unde 25% dintre companii au optat pentru utilizarea acestor inovații, iar sectorul construcțiilor și al transporturilor au avut cel mai mic procentaj de adopție, în proporție de 5%. </w:t>
+        <w:t xml:space="preserve">“pull” </w:t>
+      </w:r>
+      <w:r>
+        <w:t>îi determină pe cetățenii Serbiei, Albaniei și Bosniei și Herțegovina să emigreze</w:t>
+      </w:r>
+      <w:r>
+        <w:t>, neavând aceleași beneficii ca persoanele care ocupă funcții manageriale sau de natură profesionistă</w:t>
+      </w:r>
+      <w:r>
+        <w:t>.</w:t>
       </w:r>
     </w:p>
     <w:p>
@@ -1123,116 +1241,6 @@
           <w:u w:val="single"/>
         </w:rPr>
       </w:pPr>
-      <w:r>
-        <w:rPr>
-          <w:b/>
-          <w:bCs/>
-          <w:u w:val="single"/>
-        </w:rPr>
-        <w:t>Articolul 9</w:t>
-      </w:r>
-    </w:p>
-    <w:p>
-      <w:pPr>
-        <w:rPr>
-          <w:b/>
-          <w:bCs/>
-          <w:u w:val="single"/>
-        </w:rPr>
-      </w:pPr>
-      <w:r>
-        <w:rPr>
-          <w:b/>
-          <w:bCs/>
-          <w:u w:val="single"/>
-        </w:rPr>
-        <w:t>Articolul 10</w:t>
-      </w:r>
-    </w:p>
-    <w:p>
-      <w:pPr>
-        <w:rPr>
-          <w:b/>
-          <w:bCs/>
-          <w:u w:val="single"/>
-        </w:rPr>
-      </w:pPr>
-      <w:r>
-        <w:rPr>
-          <w:b/>
-          <w:bCs/>
-          <w:u w:val="single"/>
-        </w:rPr>
-        <w:t>Articolul 11</w:t>
-      </w:r>
-    </w:p>
-    <w:p>
-      <w:pPr>
-        <w:rPr>
-          <w:b/>
-          <w:bCs/>
-          <w:u w:val="single"/>
-        </w:rPr>
-      </w:pPr>
-      <w:r>
-        <w:rPr>
-          <w:b/>
-          <w:bCs/>
-          <w:u w:val="single"/>
-        </w:rPr>
-        <w:t>Articolul 12</w:t>
-      </w:r>
-    </w:p>
-    <w:p>
-      <w:pPr>
-        <w:rPr>
-          <w:b/>
-          <w:bCs/>
-          <w:u w:val="single"/>
-        </w:rPr>
-      </w:pPr>
-      <w:r>
-        <w:rPr>
-          <w:b/>
-          <w:bCs/>
-          <w:u w:val="single"/>
-        </w:rPr>
-        <w:t>Articolul 13</w:t>
-      </w:r>
-    </w:p>
-    <w:p>
-      <w:pPr>
-        <w:rPr>
-          <w:b/>
-          <w:bCs/>
-          <w:u w:val="single"/>
-        </w:rPr>
-      </w:pPr>
-      <w:r>
-        <w:rPr>
-          <w:b/>
-          <w:bCs/>
-          <w:u w:val="single"/>
-        </w:rPr>
-        <w:t>Articolul 14</w:t>
-      </w:r>
-    </w:p>
-    <w:p>
-      <w:pPr>
-        <w:rPr>
-          <w:b/>
-          <w:bCs/>
-          <w:u w:val="single"/>
-        </w:rPr>
-      </w:pPr>
-      <w:r>
-        <w:rPr>
-          <w:b/>
-          <w:bCs/>
-          <w:u w:val="single"/>
-        </w:rPr>
-        <w:t>Articolul 15</w:t>
-      </w:r>
     </w:p>
     <w:sectPr>
       <w:pgSz w:w="11906" w:h="16838"/>

</xml_diff>